<commit_message>
Refresh lesson plan and capability-gated learner bundle
</commit_message>
<xml_diff>
--- a/docs/lesson-plan.docx
+++ b/docs/lesson-plan.docx
@@ -588,6 +588,11 @@
     </w:p>
     <w:p>
       <w:r>
+        <w:t>For the 190–225 minute challenge, pairs can choose the offline Blockly factory or the notebook challenges. Start with simulation on every laptop. At the robot station, the instructor can demonstrate recording one fixed-jaw teleoperation stroke and replaying it through the existing robot controller. This replaces time within the challenge; it adds no extra lesson slot. A physical dispense/pick/place sequence additionally needs calibrated grip/release and qualified strokes. See the instructor Blockly guide.</w:t>
+      </w:r>
+    </w:p>
+    <w:p>
+      <w:r>
         <w:t>Use the worksheet to record answers; use the student notebook for explanations. External sites and their offline alternatives are in workshop-resources.md. The handbook reproduces the notebook text and code; build_notebooks.py is its source generator. Integrated physical sorting remains subject to the station's commissioning and acceptance evidence, independently of the notebook tests.</w:t>
       </w:r>
     </w:p>

</xml_diff>